<commit_message>
docs(thesis): redesign ER diagram (F14) to match the thesis figure design system
Rebuilds the Entity-Relationship diagram of the PostgreSQL schema in matplotlib
using the same rounded-card design, blue/purple/green palette and navy text as
the other custom figures (F5/F6), replacing the plain Mermaid erDiagram. Adds
colored PK/UK/FK badges and the users 1—∞ refresh_tokens relationship; removes the
now-stale F14_er.mmd (source is make_figures.py). Rebuilds the docx to embed it.

Co-Authored-By: Claude Opus 4.8 <noreply@anthropic.com>
Claude-Session: https://claude.ai/code/session_01ST3rZR8kpocmUj3HpdmqaB
</commit_message>
<xml_diff>
--- a/thesis/Together_Graduation_Thesis.docx
+++ b/thesis/Together_Graduation_Thesis.docx
@@ -10590,7 +10590,7 @@
       <w:r>
         <w:drawing>
           <wp:inline xmlns:a="http://schemas.openxmlformats.org/drawingml/2006/main" xmlns:pic="http://schemas.openxmlformats.org/drawingml/2006/picture">
-            <wp:extent cx="5303520" cy="3788229"/>
+            <wp:extent cx="5303520" cy="3489881"/>
             <wp:docPr id="12" name="Picture 12"/>
             <wp:cNvGraphicFramePr>
               <a:graphicFrameLocks noChangeAspect="1"/>
@@ -10611,7 +10611,7 @@
                   <pic:spPr>
                     <a:xfrm>
                       <a:off x="0" y="0"/>
-                      <a:ext cx="5303520" cy="3788229"/>
+                      <a:ext cx="5303520" cy="3489881"/>
                     </a:xfrm>
                     <a:prstGeom prst="rect"/>
                   </pic:spPr>

</xml_diff>